<commit_message>
kiem tra lai 2
</commit_message>
<xml_diff>
--- a/check/giayphep_flow.docx
+++ b/check/giayphep_flow.docx
@@ -38,7 +38,7 @@
           <w:color w:val="000000"/>
           <w:sz w:val="24"/>
         </w:rPr>
-        <w:t xml:space="preserve">6Ӣ7¬,&amp;+Ë1+ </w:t>
+        <w:t xml:space="preserve">SỞ TÀI CHÍNH </w:t>
       </w:r>
       <w:r>
         <w:br/>
@@ -51,7 +51,7 @@
           <w:color w:val="000000"/>
           <w:sz w:val="24"/>
         </w:rPr>
-        <w:t>7+¬1+3+Ӕ+Ӗ&amp;+Ë0,1+</w:t>
+        <w:t>THÀNH PHỐ HỒ CHÍ MINH</w:t>
       </w:r>
     </w:p>
     <w:p>
@@ -71,7 +71,7 @@
           <w:color w:val="000000"/>
           <w:sz w:val="24"/>
         </w:rPr>
-        <w:t>3+Ñ1*ĈĂ1*.é.,1+'2$1+</w:t>
+        <w:t>PHÒNG ĐĂNG KÝ KINH DOANH</w:t>
       </w:r>
     </w:p>
     <w:p>
@@ -105,7 +105,7 @@
           <w:color w:val="000000"/>
           <w:sz w:val="24"/>
         </w:rPr>
-        <w:t>&amp;Ӝ1*+Ñ$;­+Ӝ,&amp;+Ӫ1*+Ƭ$9,ӊ71$0</w:t>
+        <w:t>CỘNG HÒA XÃ HỘI CHỦ NGHĨA VIỆT NAM</w:t>
       </w:r>
       <w:r>
         <w:rPr>
@@ -115,7 +115,7 @@
           <w:color w:val="000000"/>
           <w:sz w:val="24"/>
         </w:rPr>
-        <w:t>ĈӝFOұS7ӵGR+ҥQKSK~F</w:t>
+        <w:t>Độc lập - Tự do - Hạnh phúc</w:t>
       </w:r>
     </w:p>
     <w:p>
@@ -149,7 +149,7 @@
           <w:color w:val="000000"/>
           <w:sz w:val="28"/>
         </w:rPr>
-        <w:t xml:space="preserve">*,Ҩ&lt;&amp;+Ӭ1*1+Ұ1ĈĂ1*.éĈӎ$Ĉ,ӆ0.,1+'2$1+ </w:t>
+        <w:t xml:space="preserve">GIẤY CHỨNG NHẬN ĐĂNG KÝ ĐỊA ĐIỂM KINH DOANH </w:t>
       </w:r>
       <w:r>
         <w:rPr>
@@ -159,7 +159,7 @@
           <w:color w:val="000000"/>
           <w:sz w:val="28"/>
         </w:rPr>
-        <w:t>0mVӕÿӏDÿLӇPNLQKGRDQK</w:t>
+        <w:t xml:space="preserve">Mã số địa điểm kinh doanh: </w:t>
       </w:r>
       <w:r>
         <w:rPr>
@@ -189,27 +189,7 @@
           <w:color w:val="000000"/>
           <w:sz w:val="28"/>
         </w:rPr>
-        <w:t>ĈăQJNêO̯</w:t>
-      </w:r>
-      <w:r>
-        <w:rPr>
-          <w:rFonts w:ascii="Times New Roman" w:hAnsi="Times New Roman" w:eastAsia="Times New Roman"/>
-          <w:b w:val="0"/>
-          <w:i/>
-          <w:color w:val="000000"/>
-          <w:sz w:val="28"/>
-        </w:rPr>
-        <w:t>Qÿ̯</w:t>
-      </w:r>
-      <w:r>
-        <w:rPr>
-          <w:rFonts w:ascii="Times New Roman" w:hAnsi="Times New Roman" w:eastAsia="Times New Roman"/>
-          <w:b w:val="0"/>
-          <w:i/>
-          <w:color w:val="000000"/>
-          <w:sz w:val="28"/>
-        </w:rPr>
-        <w:t>XQJj\WKiQJQăP</w:t>
+        <w:t>Đăng ký lần đầu, ngày 02 tháng 10 năm 2026</w:t>
       </w:r>
     </w:p>
     <w:p>
@@ -243,7 +223,7 @@
           <w:color w:val="000000"/>
           <w:sz w:val="28"/>
         </w:rPr>
-        <w:t>ÿӏDÿLӇPNLQKGRDQK</w:t>
+        <w:t>địa điểm kinh doanh</w:t>
       </w:r>
       <w:r>
         <w:rPr>
@@ -263,7 +243,7 @@
           <w:color w:val="000000"/>
           <w:sz w:val="28"/>
         </w:rPr>
-        <w:t>Ĉӎ$Ĉ,ӆ0.,1+'2$1+;Ï0&amp;+,ӂ8±</w:t>
+        <w:t xml:space="preserve">ĐỊA ĐIỂM KINH DOANH XÓM CHIẾU – </w:t>
       </w:r>
       <w:r>
         <w:rPr>
@@ -283,7 +263,7 @@
           <w:color w:val="000000"/>
           <w:sz w:val="28"/>
         </w:rPr>
-        <w:t xml:space="preserve">71++6Ҧ1;8Ҩ77Ұ3Ĉ2¬1ĈҤ,9,ӊ7 </w:t>
+        <w:t xml:space="preserve">TNHH SẢN XUẤT TẬP ĐOÀN ĐẠI VIỆT </w:t>
       </w:r>
       <w:r>
         <w:br/>
@@ -306,7 +286,7 @@
           <w:color w:val="000000"/>
           <w:sz w:val="28"/>
         </w:rPr>
-        <w:t xml:space="preserve">ÿӏDÿLӇPNLQKGRDQKYLӃWEҵQJWLӃQJQѭӟFQJRjL </w:t>
+        <w:t xml:space="preserve">địa điểm kinh doanh viết bằng tiếng nước ngoài: </w:t>
       </w:r>
       <w:r>
         <w:br/>
@@ -329,7 +309,7 @@
           <w:color w:val="000000"/>
           <w:sz w:val="28"/>
         </w:rPr>
-        <w:t>ÿӏDÿLӇPNLQKGRDQKYLӃWWҳW</w:t>
+        <w:t xml:space="preserve">địa điểm kinh doanh viết tắt: </w:t>
       </w:r>
       <w:r>
         <w:br/>
@@ -342,7 +322,7 @@
           <w:color w:val="000000"/>
           <w:sz w:val="28"/>
         </w:rPr>
-        <w:t>ĈӏDFKӍ</w:t>
+        <w:t xml:space="preserve">2. Địa chỉ: </w:t>
       </w:r>
       <w:r>
         <w:br/>
@@ -355,67 +335,7 @@
           <w:color w:val="000000"/>
           <w:sz w:val="28"/>
         </w:rPr>
-        <w:t>%/r4X͙</w:t>
-      </w:r>
-      <w:r>
-        <w:rPr>
-          <w:rFonts w:ascii="Times New Roman" w:hAnsi="Times New Roman" w:eastAsia="Times New Roman"/>
-          <w:b w:val="0"/>
-          <w:i/>
-          <w:color w:val="000000"/>
-          <w:sz w:val="28"/>
-        </w:rPr>
-        <w:t>F+˱QJ3K˱ͥ</w:t>
-      </w:r>
-      <w:r>
-        <w:rPr>
-          <w:rFonts w:ascii="Times New Roman" w:hAnsi="Times New Roman" w:eastAsia="Times New Roman"/>
-          <w:b w:val="0"/>
-          <w:i/>
-          <w:color w:val="000000"/>
-          <w:sz w:val="28"/>
-        </w:rPr>
-        <w:t>QJ;yP&amp;KL͇</w:t>
-      </w:r>
-      <w:r>
-        <w:rPr>
-          <w:rFonts w:ascii="Times New Roman" w:hAnsi="Times New Roman" w:eastAsia="Times New Roman"/>
-          <w:b w:val="0"/>
-          <w:i/>
-          <w:color w:val="000000"/>
-          <w:sz w:val="28"/>
-        </w:rPr>
-        <w:t>X7KjQKSK͙</w:t>
-      </w:r>
-      <w:r>
-        <w:rPr>
-          <w:rFonts w:ascii="Times New Roman" w:hAnsi="Times New Roman" w:eastAsia="Times New Roman"/>
-          <w:b w:val="0"/>
-          <w:i/>
-          <w:color w:val="000000"/>
-          <w:sz w:val="28"/>
-        </w:rPr>
-        <w:t>+͛</w:t>
-      </w:r>
-      <w:r>
-        <w:rPr>
-          <w:rFonts w:ascii="Times New Roman" w:hAnsi="Times New Roman" w:eastAsia="Times New Roman"/>
-          <w:b w:val="0"/>
-          <w:i/>
-          <w:color w:val="000000"/>
-          <w:sz w:val="28"/>
-        </w:rPr>
-        <w:t>&amp;Kt0LQK9L͏</w:t>
-      </w:r>
-      <w:r>
-        <w:rPr>
-          <w:rFonts w:ascii="Times New Roman" w:hAnsi="Times New Roman" w:eastAsia="Times New Roman"/>
-          <w:b w:val="0"/>
-          <w:i/>
-          <w:color w:val="000000"/>
-          <w:sz w:val="28"/>
-        </w:rPr>
-        <w:t>W1DP</w:t>
+        <w:t>26B Lê Quốc Hưng, Phường Xóm Chiếu, Thành phố Hồ Chí Minh, Việt Nam</w:t>
       </w:r>
       <w:r>
         <w:br/>
@@ -428,7 +348,7 @@
           <w:color w:val="000000"/>
           <w:sz w:val="28"/>
         </w:rPr>
-        <w:t>ĈLӋQWKRҥL</w:t>
+        <w:t xml:space="preserve">Điện thoại: </w:t>
       </w:r>
       <w:r>
         <w:rPr>
@@ -451,7 +371,7 @@
           <w:color w:val="000000"/>
           <w:sz w:val="28"/>
         </w:rPr>
-        <w:t>6ӕ)D[</w:t>
+        <w:t xml:space="preserve">Số Fax: </w:t>
       </w:r>
     </w:p>
     <w:p>
@@ -482,7 +402,7 @@
           <w:color w:val="000000"/>
           <w:sz w:val="28"/>
         </w:rPr>
-        <w:t>7KѭÿLӋQWӱ</w:t>
+        <w:t xml:space="preserve">Thư điện tử: </w:t>
       </w:r>
       <w:r>
         <w:rPr>
@@ -502,7 +422,7 @@
           <w:color w:val="000000"/>
           <w:sz w:val="28"/>
         </w:rPr>
-        <w:t>7K{QJWLQYӅQJѭӡLÿӭQJÿҫX</w:t>
+        <w:t>3. Thông tin về người đứng đầu</w:t>
       </w:r>
     </w:p>
     <w:p>
@@ -569,7 +489,7 @@
     <w:tbl>
       <w:tblPr>
         <w:tblW w:type="auto" w:w="0"/>
-        <w:tblInd w:w="0.0" w:type="dxa"/>
+        <w:tblInd w:w="0" w:type="dxa"/>
         <w:tblLayout w:type="fixed"/>
         <w:tblLook w:firstColumn="1" w:firstRow="1" w:lastColumn="0" w:lastRow="0" w:noHBand="0" w:noVBand="1" w:val="04A0"/>
       </w:tblPr>
@@ -608,7 +528,7 @@
                 <w:color w:val="000000"/>
                 <w:sz w:val="28"/>
               </w:rPr>
-              <w:t>+ӑFKӳÿӋPYjWrQ</w:t>
+              <w:t>Họ, chữ đệm và tên:</w:t>
             </w:r>
             <w:r>
               <w:rPr>
@@ -618,7 +538,7 @@
                 <w:color w:val="000000"/>
                 <w:sz w:val="28"/>
               </w:rPr>
-              <w:t>3+Ҥ0ĈӬ&amp;+Ӑ&amp;</w:t>
+              <w:t>PHẠM ĐỨC HỌC</w:t>
             </w:r>
           </w:p>
         </w:tc>
@@ -648,7 +568,7 @@
                 <w:color w:val="000000"/>
                 <w:sz w:val="28"/>
               </w:rPr>
-              <w:t>*LӟLWtQK</w:t>
+              <w:t>Giới tính:</w:t>
             </w:r>
           </w:p>
         </w:tc>
@@ -657,10 +577,6 @@
             <w:tcW w:type="dxa" w:w="1400"/>
             <w:vMerge w:val="restart"/>
             <w:tcBorders/>
-            <w:tcMar>
-              <w:start w:w="0" w:type="dxa"/>
-              <w:end w:w="0" w:type="dxa"/>
-            </w:tcMar>
             <w:tcMar>
               <w:start w:w="0" w:type="dxa"/>
               <w:end w:w="0" w:type="dxa"/>
@@ -718,7 +634,7 @@
                 <w:color w:val="000000"/>
                 <w:sz w:val="28"/>
               </w:rPr>
-              <w:t>1Jj\WKiQJQăPVLQK</w:t>
+              <w:t>Ngày, tháng, năm sinh:</w:t>
             </w:r>
             <w:r>
               <w:rPr>
@@ -758,7 +674,7 @@
                 <w:color w:val="000000"/>
                 <w:sz w:val="28"/>
               </w:rPr>
-              <w:t>4XӕFWӏFK</w:t>
+              <w:t xml:space="preserve">Quốc tịch: </w:t>
             </w:r>
             <w:r>
               <w:rPr>
@@ -768,17 +684,7 @@
                 <w:color w:val="000000"/>
                 <w:sz w:val="28"/>
               </w:rPr>
-              <w:t>9L͏</w:t>
-            </w:r>
-            <w:r>
-              <w:rPr>
-                <w:rFonts w:ascii="Times New Roman" w:hAnsi="Times New Roman" w:eastAsia="Times New Roman"/>
-                <w:b w:val="0"/>
-                <w:i/>
-                <w:color w:val="000000"/>
-                <w:sz w:val="28"/>
-              </w:rPr>
-              <w:t>W1DP</w:t>
+              <w:t>Việt Nam</w:t>
             </w:r>
           </w:p>
         </w:tc>
@@ -809,7 +715,7 @@
           <w:color w:val="000000"/>
           <w:sz w:val="28"/>
         </w:rPr>
-        <w:t>6ӕÿӏQKGDQKFiQKkQ</w:t>
+        <w:t>Số định danh cá nhân: 027094009151</w:t>
       </w:r>
     </w:p>
     <w:p>
@@ -832,7 +738,7 @@
           <w:color w:val="000000"/>
           <w:sz w:val="28"/>
         </w:rPr>
-        <w:t>ĈӏDFKӍOLrQOҥF</w:t>
+        <w:t>Địa chỉ liên lạc:</w:t>
       </w:r>
       <w:r>
         <w:rPr>
@@ -842,7 +748,7 @@
           <w:color w:val="000000"/>
           <w:sz w:val="28"/>
         </w:rPr>
-        <w:t>&amp;ăQK͡</w:t>
+        <w:t xml:space="preserve">Căn hộ C05.03 Chung cư KimHong - Fortuna, 306-308 Vườn Lài, </w:t>
       </w:r>
       <w:r>
         <w:rPr>
@@ -852,77 +758,7 @@
           <w:color w:val="000000"/>
           <w:sz w:val="28"/>
         </w:rPr>
-        <w:t>&amp;&amp;KXQJF˱.LP+RQJ)RUWXQD9˱ͥ</w:t>
-      </w:r>
-      <w:r>
-        <w:rPr>
-          <w:rFonts w:ascii="Times New Roman" w:hAnsi="Times New Roman" w:eastAsia="Times New Roman"/>
-          <w:b w:val="0"/>
-          <w:i/>
-          <w:color w:val="000000"/>
-          <w:sz w:val="28"/>
-        </w:rPr>
-        <w:t xml:space="preserve">Q/jL </w:t>
-      </w:r>
-      <w:r>
-        <w:rPr>
-          <w:rFonts w:ascii="Times New Roman" w:hAnsi="Times New Roman" w:eastAsia="Times New Roman"/>
-          <w:b w:val="0"/>
-          <w:i/>
-          <w:color w:val="000000"/>
-          <w:sz w:val="28"/>
-        </w:rPr>
-        <w:t>3K˱ͥ</w:t>
-      </w:r>
-      <w:r>
-        <w:rPr>
-          <w:rFonts w:ascii="Times New Roman" w:hAnsi="Times New Roman" w:eastAsia="Times New Roman"/>
-          <w:b w:val="0"/>
-          <w:i/>
-          <w:color w:val="000000"/>
-          <w:sz w:val="28"/>
-        </w:rPr>
-        <w:t>QJ3K~7K͕</w:t>
-      </w:r>
-      <w:r>
-        <w:rPr>
-          <w:rFonts w:ascii="Times New Roman" w:hAnsi="Times New Roman" w:eastAsia="Times New Roman"/>
-          <w:b w:val="0"/>
-          <w:i/>
-          <w:color w:val="000000"/>
-          <w:sz w:val="28"/>
-        </w:rPr>
-        <w:t>+zD7KjQKSK͙</w:t>
-      </w:r>
-      <w:r>
-        <w:rPr>
-          <w:rFonts w:ascii="Times New Roman" w:hAnsi="Times New Roman" w:eastAsia="Times New Roman"/>
-          <w:b w:val="0"/>
-          <w:i/>
-          <w:color w:val="000000"/>
-          <w:sz w:val="28"/>
-        </w:rPr>
-        <w:t>+͛</w:t>
-      </w:r>
-      <w:r>
-        <w:rPr>
-          <w:rFonts w:ascii="Times New Roman" w:hAnsi="Times New Roman" w:eastAsia="Times New Roman"/>
-          <w:b w:val="0"/>
-          <w:i/>
-          <w:color w:val="000000"/>
-          <w:sz w:val="28"/>
-        </w:rPr>
-        <w:t>&amp;Kt0LQK9L͏</w:t>
-      </w:r>
-      <w:r>
-        <w:rPr>
-          <w:rFonts w:ascii="Times New Roman" w:hAnsi="Times New Roman" w:eastAsia="Times New Roman"/>
-          <w:b w:val="0"/>
-          <w:i/>
-          <w:color w:val="000000"/>
-          <w:sz w:val="28"/>
-        </w:rPr>
-        <w:t xml:space="preserve">W1DP </w:t>
+        <w:t xml:space="preserve">Phường Phú Thọ Hòa, Thành phố Hồ Chí Minh, Việt Nam </w:t>
       </w:r>
       <w:r>
         <w:br/>
@@ -945,7 +781,7 @@
           <w:color w:val="000000"/>
           <w:sz w:val="28"/>
         </w:rPr>
-        <w:t xml:space="preserve">7K{QJWLQYӅGRDQKQJKLӋSFKLQKiQKFKӫTXҧQ </w:t>
+        <w:t xml:space="preserve">Thông tin về doanh nghiệp/chi nhánh chủ quản: </w:t>
       </w:r>
       <w:r>
         <w:br/>
@@ -958,7 +794,7 @@
           <w:color w:val="000000"/>
           <w:sz w:val="28"/>
         </w:rPr>
-        <w:t xml:space="preserve">7rQGRDQKQJKLӋSFKLQKiQK&amp;Ð1*7&lt;71++6Ҧ1;8Ҩ77Ұ3Ĉ2¬1ĈҤ,9,ӊ7 </w:t>
+        <w:t xml:space="preserve">Tên doanh nghiệp/chi nhánh: CÔNG TY TNHH SẢN XUẤT TẬP ĐOÀN ĐẠI VIỆT </w:t>
       </w:r>
       <w:r>
         <w:rPr>
@@ -968,7 +804,7 @@
           <w:color w:val="000000"/>
           <w:sz w:val="28"/>
         </w:rPr>
-        <w:t>0mVӕGRDQKQJKLӋSFKLQKiQK</w:t>
+        <w:t xml:space="preserve">Mã số doanh nghiệp/chi nhánh: </w:t>
       </w:r>
       <w:r>
         <w:rPr>
@@ -991,7 +827,7 @@
           <w:color w:val="000000"/>
           <w:sz w:val="28"/>
         </w:rPr>
-        <w:t>ĈӏDFKӍWUөVӣFKtQKFӫDGRDQKQJKLӋSFKLQKiQK</w:t>
+        <w:t>Địa chỉ trụ sở chính của doanh nghiệp/chi nhánh</w:t>
       </w:r>
       <w:r>
         <w:rPr>
@@ -1011,7 +847,7 @@
           <w:color w:val="000000"/>
           <w:sz w:val="28"/>
         </w:rPr>
-        <w:t xml:space="preserve">/{)ĈѭӡQJVӕ&amp;&amp;1+ҧL6ѫQ </w:t>
+        <w:t xml:space="preserve">Lô F1 Đường số 10, CCN Hải Sơn, </w:t>
       </w:r>
       <w:r>
         <w:rPr>
@@ -1021,7 +857,7 @@
           <w:color w:val="000000"/>
           <w:sz w:val="28"/>
         </w:rPr>
-        <w:t>;m0ӻ+ҥQK7ӍQK7k\1LQK9LӋW1DP</w:t>
+        <w:t>Xã Mỹ Hạnh, Tỉnh Tây Ninh, Việt Nam</w:t>
       </w:r>
     </w:p>
     <w:p>
@@ -1041,7 +877,7 @@
           <w:color w:val="000000"/>
           <w:sz w:val="28"/>
         </w:rPr>
-        <w:t xml:space="preserve">.775ѬӢ1*3+Ñ1* </w:t>
+        <w:t xml:space="preserve">KT.TRƯỞNG PHÒNG </w:t>
       </w:r>
       <w:r>
         <w:br/>
@@ -1054,7 +890,7 @@
           <w:color w:val="000000"/>
           <w:sz w:val="28"/>
         </w:rPr>
-        <w:t>3+Ï75ѬӢ1*3+Ñ1*</w:t>
+        <w:t>PHÓ TRƯỞNG PHÒNG</w:t>
       </w:r>
     </w:p>
     <w:sectPr>

</xml_diff>